<commit_message>
sua mensagem de commitAtualização
</commit_message>
<xml_diff>
--- a/Anotações dashboard SMPU.docx
+++ b/Anotações dashboard SMPU.docx
@@ -219,6 +219,30 @@
         <w:ind w:left="284"/>
       </w:pPr>
       <w:r>
+        <w:t>- O zoneamento AMS-2 utiliza de uma altura máxima, e não um limite de gabaritos. Verificar se esse zoneamento teria regra própria no campo “gabarito”, ou se o lançamento seria de altura arredondada;</w:t>
+      </w:r>
+    </w:p>
+    <w:p>
+      <w:pPr>
+        <w:pStyle w:val="PargrafodaLista"/>
+        <w:ind w:left="284"/>
+      </w:pPr>
+    </w:p>
+    <w:p>
+      <w:pPr>
+        <w:pStyle w:val="PargrafodaLista"/>
+        <w:ind w:left="284"/>
+      </w:pPr>
+      <w:r>
+        <w:t>Solo Criado</w:t>
+      </w:r>
+    </w:p>
+    <w:p>
+      <w:pPr>
+        <w:pStyle w:val="PargrafodaLista"/>
+        <w:ind w:left="284"/>
+      </w:pPr>
+      <w:r>
         <w:t>- No preenchimento do solo criado no Sul, atualmente, como o código está voltado somente para o modelo de solo criado geral, as tabelas indicam como erro a presença de mais de 5% de aquisição de índice na forma de infraestrutura;</w:t>
       </w:r>
     </w:p>
@@ -227,6 +251,128 @@
         <w:pStyle w:val="PargrafodaLista"/>
         <w:ind w:left="284"/>
       </w:pPr>
+    </w:p>
+    <w:p>
+      <w:pPr>
+        <w:pStyle w:val="PargrafodaLista"/>
+        <w:ind w:left="284"/>
+      </w:pPr>
+      <w:r>
+        <w:t>TAC:</w:t>
+      </w:r>
+    </w:p>
+    <w:p>
+      <w:pPr>
+        <w:pStyle w:val="PargrafodaLista"/>
+        <w:ind w:left="284"/>
+      </w:pPr>
+      <w:r>
+        <w:t>- Por algum motivo, ao tentar calcular o TAC #04 (Processo 8705/2025)</w:t>
+      </w:r>
+      <w:r>
+        <w:t xml:space="preserve"> ou #05 (Processo 61863/2025)</w:t>
+      </w:r>
+      <w:r>
+        <w:t>, o servidor apresenta erro 500.</w:t>
+      </w:r>
+    </w:p>
+    <w:p>
+      <w:pPr>
+        <w:pStyle w:val="PargrafodaLista"/>
+        <w:ind w:left="284"/>
+      </w:pPr>
+    </w:p>
+    <w:p>
+      <w:pPr>
+        <w:pStyle w:val="PargrafodaLista"/>
+        <w:ind w:left="284"/>
+      </w:pPr>
+      <w:r>
+        <w:t>Cadastro de Obras</w:t>
+      </w:r>
+    </w:p>
+    <w:p>
+      <w:pPr>
+        <w:pStyle w:val="PargrafodaLista"/>
+        <w:ind w:left="284"/>
+      </w:pPr>
+      <w:r>
+        <w:lastRenderedPageBreak/>
+        <w:t xml:space="preserve">- Como existem muitas legalizações que ocorrem em residências sem características bem definidas, seria interessante já definir como deve ser nomeado: pelo número de processo, nome da rua, requerente, </w:t>
+      </w:r>
+      <w:proofErr w:type="spellStart"/>
+      <w:r>
+        <w:t>etc</w:t>
+      </w:r>
+      <w:proofErr w:type="spellEnd"/>
+      <w:r>
+        <w:t>;</w:t>
+      </w:r>
+    </w:p>
+    <w:p>
+      <w:pPr>
+        <w:pStyle w:val="PargrafodaLista"/>
+        <w:ind w:left="284"/>
+      </w:pPr>
+    </w:p>
+    <w:p>
+      <w:pPr>
+        <w:pStyle w:val="PargrafodaLista"/>
+        <w:ind w:left="284"/>
+      </w:pPr>
+      <w:r>
+        <w:t>Alterações de dados cadastrados na base:</w:t>
+      </w:r>
+    </w:p>
+    <w:p>
+      <w:pPr>
+        <w:pStyle w:val="PargrafodaLista"/>
+        <w:ind w:left="284"/>
+      </w:pPr>
+      <w:r>
+        <w:t xml:space="preserve">- Quando é selecionado um zoneamento, CUB, responsável técnico, </w:t>
+      </w:r>
+      <w:proofErr w:type="spellStart"/>
+      <w:r>
+        <w:t>etc</w:t>
+      </w:r>
+      <w:proofErr w:type="spellEnd"/>
+      <w:r>
+        <w:t xml:space="preserve">, e tais dados já estão vinculados em cada lançamento, todas as alterações na base de dados alteram imediatamente as demais informações. Por exemplo: CUB nomeado maio/25, ao ser renomeado na base para maio/26, já renomeia todos os cadastros de obra que utilizam do CUB maio/25 para maio/26. Isso é útil, porém, caso exista alguma alteração que demanda histórico (Um zoneamento cujo parâmetro é alterado, por exemplo), pode ser afetado indevidamente obras cadastradas previamente. </w:t>
+      </w:r>
+    </w:p>
+    <w:p>
+      <w:pPr>
+        <w:pStyle w:val="PargrafodaLista"/>
+        <w:ind w:left="284"/>
+      </w:pPr>
+    </w:p>
+    <w:p>
+      <w:pPr>
+        <w:pStyle w:val="PargrafodaLista"/>
+        <w:ind w:left="284"/>
+      </w:pPr>
+      <w:r>
+        <w:t>Dashboard:</w:t>
+      </w:r>
+    </w:p>
+    <w:p>
+      <w:pPr>
+        <w:pStyle w:val="PargrafodaLista"/>
+        <w:ind w:left="284"/>
+      </w:pPr>
+      <w:r>
+        <w:t>- É pego a data de entrada no sistema, e não a data de abertura do protocolo ou a referência do CUB para cálculo, para o número de processos abertos por mês;</w:t>
+      </w:r>
+    </w:p>
+    <w:p>
+      <w:pPr>
+        <w:pStyle w:val="PargrafodaLista"/>
+        <w:ind w:left="284"/>
+      </w:pPr>
+      <w:r>
+        <w:t>- O mesmo se aplica para os valores calculados por mês</w:t>
+      </w:r>
     </w:p>
     <w:p>
       <w:pPr>

</xml_diff>